<commit_message>
cập nhật mẫu QD KTR
</commit_message>
<xml_diff>
--- a/static/media/1.qd_ktra.docx
+++ b/static/media/1.qd_ktra.docx
@@ -376,7 +376,15 @@
           <w:color w:val="000000" w:themeColor="text1"/>
           <w:szCs w:val="28"/>
         </w:rPr>
-        <w:t>Về việc kiểm tra chấp hành pháp luật thuế tại</w:t>
+        <w:t>Về việc kiểm tra thuế tại</w:t>
+      </w:r>
+      <w:r>
+        <w:rPr>
+          <w:b/>
+          <w:color w:val="000000" w:themeColor="text1"/>
+          <w:szCs w:val="28"/>
+        </w:rPr>
+        <w:t xml:space="preserve"> </w:t>
       </w:r>
     </w:p>
     <w:p>
@@ -777,31 +785,7 @@
           <w:szCs w:val="28"/>
           <w:lang w:val="nl-NL"/>
         </w:rPr>
-        <w:t xml:space="preserve">Căn cứ &lt;qd_tkt_tct&gt; </w:t>
-      </w:r>
-      <w:r>
-        <w:rPr>
-          <w:i/>
-          <w:szCs w:val="28"/>
-          <w:lang w:val="nl-NL"/>
-        </w:rPr>
-        <w:t>&lt;qd_tkt_tct_ngay_ban_hanh&gt;</w:t>
-      </w:r>
-      <w:r>
-        <w:rPr>
-          <w:i/>
-          <w:szCs w:val="28"/>
-          <w:lang w:val="nl-NL"/>
-        </w:rPr>
-        <w:t xml:space="preserve"> </w:t>
-      </w:r>
-      <w:r>
-        <w:rPr>
-          <w:i/>
-          <w:szCs w:val="28"/>
-          <w:lang w:val="nl-NL"/>
-        </w:rPr>
-        <w:t xml:space="preserve">của Tổng cục Thuế </w:t>
+        <w:t xml:space="preserve">Căn cứ &lt;qd_tkt_tct&gt; của Tổng cục Thuế </w:t>
       </w:r>
       <w:r>
         <w:rPr>
@@ -1628,7 +1612,6 @@
           <w:color w:val="000000" w:themeColor="text1"/>
           <w:szCs w:val="28"/>
         </w:rPr>
-        <w:lastRenderedPageBreak/>
         <w:t>Điều 3.</w:t>
       </w:r>
       <w:r>
@@ -1694,6 +1677,7 @@
           <w:sz w:val="24"/>
           <w:szCs w:val="24"/>
         </w:rPr>
+        <w:lastRenderedPageBreak/>
         <w:t>Nơi nhận:</w:t>
       </w:r>
       <w:r>

</xml_diff>